<commit_message>
sync: QRH summary arXiv-draft C_MT-proven six-place wording + S7.11/S7.12 archives + 2704 build evidence 2026-10-29
</commit_message>
<xml_diff>
--- a/document/d1/en/QRH-arXiv-draft-single-family-pairing-constant-L(s,chi5).docx
+++ b/document/d1/en/QRH-arXiv-draft-single-family-pairing-constant-L(s,chi5).docx
@@ -1574,7 +1574,7 @@
         </m:box>
       </m:oMath>
       <w:r>
-        <w:t>. Finally, we report a Lean 4 formalization (project QRH, mathlib v4.34.0-rc2) with 26 proven lemmas and a full build of 2604 jobs passing, while honestly recording the axioms that remain on long lines.</w:t>
+        <w:t>. Finally, we report a Lean 4 formalization (project QRH, mathlib v4.34.0-rc2) with 35+ proven lemmas and a full build of 2704 jobs passing (2026-10-29), including the proved constant bound C_MT &lt; 4/3, while honestly recording the axioms that remain on long lines.</w:t>
       </w:r>
     </w:p>
     <w:p>
@@ -2614,7 +2614,7 @@
         <w:ind w:firstLineChars="0"/>
       </w:pPr>
       <w:r>
-        <w:t>A Lean 4 formalization of the proof skeleton, with 26 lemmas proved and a full build of 2604 jobs passing; the axioms that remain on long lines are recorded without omission.</w:t>
+        <w:t>A Lean 4 formalization of the proof skeleton, with 35+ lemmas proved and a full build of 2704 jobs passing (2026-10-29), including the standing constant bound C_MT &lt; 4/3; the axioms that remain on long lines are recorded without omission.</w:t>
       </w:r>
     </w:p>
     <w:p>
@@ -5462,6 +5462,9 @@
       </m:oMath>
       <w:r>
         <w:t>.</w:t>
+      </w:r>
+      <w:r>
+        <w:t xml:space="preserve"> The bound C_MT &lt; 4/3 is proved in Lean (Section 9; pure rational chain, 2026-10-29).</w:t>
       </w:r>
     </w:p>
     <w:p>
@@ -15122,7 +15125,7 @@
     </w:p>
     <w:p>
       <w:r>
-        <w:t>The proof skeleton is formalized in Lean 4 (mathlib v4.34.0-rc2) in the project QRH (C:\proj2\QRH): modules S7_1_Core.lean, S7_1_Main.lean, S7_1_Stage3.lean with the one-way dependency Core→Main→Stage3. The full build runs 2604 jobs and passes (2026-10-27, main_l2_full.txt). 26 lemmas are proved, including: kernel analytic facts (</w:t>
+        <w:t>The proof skeleton is formalized in Lean 4 (mathlib v4.34.0-rc2) in the project QRH (C:\proj2\QRH): modules S7_1_Core.lean, S7_1_Main.lean, S7_1_Stage3.lean with the one-way dependency Core→Main→Stage3. The full build runs 2704 jobs and passes (2026-10-29, dbg_build_fourier.txt). 35+ lemmas are proved, including: kernel analytic facts (</w:t>
       </w:r>
       <m:oMath>
         <m:box>
@@ -15777,6 +15780,9 @@
       <w:r>
         <w:t xml:space="preserve"> (the asymptotic big-O notation is deliberately avoided). Honest disclosure: the main theorem chain holds under the named axioms landau_explicit_L, siegel_walfisz_chi5 and the BGS transplant axioms bgs3--bgs5; clearing these axioms to theorems is a PNT-in-arithmetic-progressions-scale long line, as recorded in the file layout section of the summary [11].</w:t>
       </w:r>
+      <w:r>
+        <w:t xml:space="preserve"> The standing constant bound C_MT &lt; 4/3 is proved in Lean as C_MT_lt_four_thirds: the cos fourth-order upper bound 73/96 and the sin lower bound 11/(12*sqrt 2) - sqrt 2/800 at x0 = 1/sqrt 2 give cot(1/sqrt 2) &lt; 1825/(1097*sqrt 2), hence C_MT &lt; 2922/2194 &lt; 4/3 - a pure rational chain with no integral layer and no aggregate dependency. The Fourier operator fourierCos is now a Bochner-integral true definition and its scale law fourierCos_scale is proved (2026-10-29); the build was rerun at 2704 jobs, all green (dbg_build_fourier.txt).</w:t>
+      </w:r>
     </w:p>
     <w:p>
       <w:pPr>
@@ -16239,7 +16245,7 @@
         </m:box>
       </m:oMath>
       <w:r>
-        <w:t xml:space="preserve">) and a Lean 4 formalization with 26 proved lemmas and a full 2604-job green build. The honest boundaries are recorded throughout: (H1) is an explicit hypothesis because no unconditional single-family pairing formula exists in the literature; the constants </w:t>
+        <w:t xml:space="preserve">) and a Lean 4 formalization with 35+ proved lemmas and a full 2704-job green build (2026-10-29), including the proved constant bound C_MT &lt; 4/3. The honest boundaries are recorded throughout: (H1) is an explicit hypothesis because no unconditional single-family pairing formula exists in the literature; the constants </w:t>
       </w:r>
       <m:oMath>
         <m:box>
@@ -16528,7 +16534,7 @@
         <w:rPr>
           <w:sz w:val="18"/>
         </w:rPr>
-        <w:t>[11] QRH summary: QRH_summary.md / QRH_summary_en.md (C:\proj2\QRH, 2026-10-27); file layout and build evidence main_l2_full.txt (2604 jobs green).</w:t>
+        <w:t>[11] QRH summary: QRH_summary.md / QRH_summary_en.md (C:\proj2\QRH, 2026-10-29); file layout and build evidence dbg_build_fourier.txt (2704 jobs green).</w:t>
       </w:r>
     </w:p>
     <w:p>

</xml_diff>